<commit_message>
Final Emergency Fix: Liberal modification logic for buyer orders
</commit_message>
<xml_diff>
--- a/1-Final/架構說明.docx
+++ b/1-Final/架構說明.docx
@@ -11579,27 +11579,35 @@
       </w:r>
       <w:r>
         <w:rPr>
-          <w:rFonts w:hint="eastAsia"/>
-          <w:b/>
-          <w:bCs/>
-        </w:rPr>
-        <w:t>溢多商品管理</w:t>
-      </w:r>
-    </w:p>
-    <w:p>
-      <w:pPr>
-        <w:rPr>
-          <w:b/>
-          <w:bCs/>
-        </w:rPr>
-      </w:pPr>
-      <w:r>
-        <w:rPr>
-          <w:b/>
-          <w:bCs/>
-        </w:rPr>
-        <w:t>LIFF ID: 2008857998-qCQWSTKf</w:t>
-      </w:r>
+          <w:b/>
+          <w:bCs/>
+        </w:rPr>
+        <w:t>liff-product-list.html</w:t>
+      </w:r>
+    </w:p>
+    <w:p>
+      <w:pPr>
+        <w:rPr>
+          <w:b/>
+          <w:bCs/>
+        </w:rPr>
+      </w:pPr>
+      <w:r>
+        <w:rPr>
+          <w:b/>
+          <w:bCs/>
+        </w:rPr>
+        <w:t xml:space="preserve">LIFF ID: </w:t>
+      </w:r>
+      <w:bookmarkStart w:id="0" w:name="_GoBack"/>
+      <w:r>
+        <w:rPr>
+          <w:b/>
+          <w:bCs/>
+        </w:rPr>
+        <w:t>2008857998-qCQWSTKf</w:t>
+      </w:r>
+      <w:bookmarkEnd w:id="0"/>
     </w:p>
     <w:p>
       <w:pPr>
@@ -11625,7 +11633,15 @@
             <w:b/>
             <w:bCs/>
           </w:rPr>
-          <w:t>https://line-group-buy-bot-api.onrender.com/liff/liff-overstock-admin.html</w:t>
+          <w:t>https://line-group-buy-bot-api.onrender.com/liff/</w:t>
+        </w:r>
+        <w:r>
+          <w:rPr>
+            <w:rStyle w:val="a3"/>
+            <w:b/>
+            <w:bCs/>
+          </w:rPr>
+          <w:t>liff-product-list.html</w:t>
         </w:r>
       </w:hyperlink>
     </w:p>
@@ -14486,8 +14502,6 @@
         </w:rPr>
         <w:br w:type="page"/>
       </w:r>
-      <w:bookmarkStart w:id="0" w:name="_GoBack"/>
-      <w:bookmarkEnd w:id="0"/>
     </w:p>
     <w:p>
       <w:pPr>
@@ -19392,6 +19406,7 @@
   <w:style w:type="character" w:default="1" w:styleId="a0">
     <w:name w:val="Default Paragraph Font"/>
     <w:uiPriority w:val="1"/>
+    <w:semiHidden/>
     <w:unhideWhenUsed/>
   </w:style>
   <w:style w:type="table" w:default="1" w:styleId="a1">
@@ -19777,7 +19792,7 @@
 </file>
 
 <file path=customXml/itemProps1.xml><?xml version="1.0" encoding="utf-8"?>
-<ds:datastoreItem xmlns:ds="http://schemas.openxmlformats.org/officeDocument/2006/customXml" ds:itemID="{4C3BF51E-71E8-48B5-B454-D1018A786355}">
+<ds:datastoreItem xmlns:ds="http://schemas.openxmlformats.org/officeDocument/2006/customXml" ds:itemID="{F0D0D5CD-88BF-4009-8F6A-312286C5B2D0}">
   <ds:schemaRefs>
     <ds:schemaRef ds:uri="http://schemas.openxmlformats.org/officeDocument/2006/bibliography"/>
   </ds:schemaRefs>

</xml_diff>